<commit_message>
docs: reemplazar Riot API por scraping de gol.gg y Leaguepedia en memoria
</commit_message>
<xml_diff>
--- a/Memoria_Jaime_Neira_Azor.docx
+++ b/Memoria_Jaime_Neira_Azor.docx
@@ -985,7 +985,7 @@
     </w:p>
     <w:p>
       <w:r>
-        <w:t xml:space="preserve">Summoner's Fantasy nace para cubrir ese hueco: una aplicación web donde los aficionados a la LEC pueden crear ligas privadas con amigos, fichar jugadores profesionales reales y competir en función de sus estadísticas reales de partida (KDA, CS por minuto, daño, etc.). Los datos se obtienen automáticamente de la API oficial de Riot Games y se actualizan mediante un pipeline programado, garantizando que los puntos reflejen siempre el rendimiento real de los jugadores.</w:t>
+        <w:t xml:space="preserve">Summoner's Fantasy nace para cubrir ese hueco: una aplicación web donde los aficionados a la LEC pueden crear ligas privadas con amigos, fichar jugadores profesionales reales y competir en función de sus estadísticas reales de partida (KDA, CS por minuto, daño, etc.). Los datos se obtienen automáticamente mediante scraping de gol.gg y Leaguepedia y se actualizan mediante un pipeline programado, garantizando que los puntos reflejen siempre el rendimiento real de los jugadores.</w:t>
       </w:r>
     </w:p>
     <w:p>
@@ -1052,7 +1052,7 @@
         </w:numPr>
       </w:pPr>
       <w:r>
-        <w:t xml:space="preserve">OE2. Desarrollar un pipeline automático que obtenga y actualice estadísticas de la API de Riot Games.</w:t>
+        <w:t xml:space="preserve">OE2. Desarrollar un pipeline automático que obtenga y actualice estadísticas de gol.gg y Leaguepedia.</w:t>
       </w:r>
     </w:p>
     <w:p>
@@ -1273,7 +1273,7 @@
         </w:numPr>
       </w:pPr>
       <w:r>
-        <w:t xml:space="preserve">Pipeline automático de datos desde la API oficial de Riot Games, sin depender de scraping.</w:t>
+        <w:t xml:space="preserve">Pipeline automático de datos desmediante scraping de gol.gg y Leaguepedia, mediante scraping de fuentes públicas.</w:t>
       </w:r>
     </w:p>
     <w:p>
@@ -1356,7 +1356,7 @@
         </w:numPr>
       </w:pPr>
       <w:r>
-        <w:t xml:space="preserve">Datos oficiales de Riot Games mediante API pública con alta fiabilidad.</w:t>
+        <w:t xml:space="preserve">Datos actualizados mediante scraping de gol.gg (vía Cloudflare Browser Rendering) y Leaguepedia.</w:t>
       </w:r>
     </w:p>
     <w:p>
@@ -1413,7 +1413,7 @@
         </w:numPr>
       </w:pPr>
       <w:r>
-        <w:t xml:space="preserve">Dependencia total de la API de Riot Games; cambios en sus políticas pueden impactar el sistema.</w:t>
+        <w:t xml:space="preserve">Dependencia total de gol.gg y Leaguepedia; cambios en sus políticas pueden impactar el sistema.</w:t>
       </w:r>
     </w:p>
     <w:p>
@@ -1515,7 +1515,7 @@
         </w:numPr>
       </w:pPr>
       <w:r>
-        <w:t xml:space="preserve">Cambios en la política de datos de Riot Games (rate limits, condiciones de uso).</w:t>
+        <w:t xml:space="preserve">Cambios en la estructura de gol.gg o Leaguepedia que rompan el scraper.</w:t>
       </w:r>
     </w:p>
     <w:p/>
@@ -1597,7 +1597,7 @@
         <w:t xml:space="preserve">Fase 2. </w:t>
       </w:r>
       <w:r>
-        <w:t xml:space="preserve">Fase 2 – Backend y pipeline de datos (noviembre 2025 – enero 2026): implementación de FastAPI, modelos de base de datos, pipeline de actualización de estadísticas de Riot Games, sistema de autenticación.</w:t>
+        <w:t xml:space="preserve">Fase 2 – Backend y pipeline de datos (noviembre 2025 – enero 2026): implementación de FastAPI, modelos de base de datos, pipeline de actualización de estadísticas mediante scraping de gol.gg y Leaguepedia, sistema de autenticación.</w:t>
       </w:r>
     </w:p>
     <w:p>
@@ -1719,7 +1719,7 @@
         </w:numPr>
       </w:pPr>
       <w:r>
-        <w:t xml:space="preserve">Acceso a la API pública de Riot Games (plan gratuito, rate-limited).</w:t>
+        <w:t xml:space="preserve">Acceso a gol.gg y Leaguepedia (acceso público, sin clave de API requerida).</w:t>
       </w:r>
     </w:p>
     <w:p>
@@ -1798,7 +1798,7 @@
         </w:numPr>
       </w:pPr>
       <w:r>
-        <w:t xml:space="preserve">API Riot Games: 0 € (plan de desarrollo gratuito).</w:t>
+        <w:t xml:space="preserve">Scraping de gol.gg y Leaguepedia: 0 € (acceso público, sin clave de API).</w:t>
       </w:r>
     </w:p>
     <w:p>
@@ -2220,7 +2220,7 @@
         </w:numPr>
       </w:pPr>
       <w:r>
-        <w:t xml:space="preserve">RF07. Un pipeline automático obtendrá las estadísticas de las partidas de la LEC desde la API de Riot Games.</w:t>
+        <w:t xml:space="preserve">RF07. Un pipeline automático obtendrá las estadísticas de las partidas de la LEC mediante scraping de gol.gg.</w:t>
       </w:r>
     </w:p>
     <w:p>
@@ -2354,7 +2354,7 @@
         </w:numPr>
       </w:pPr>
       <w:r>
-        <w:t xml:space="preserve">SS3 – Pipeline de datos Riot: scraper/consumidor de la API de Riot Games, normalización de estadísticas y persistencia en base de datos.</w:t>
+        <w:t xml:space="preserve">SS3 – Pipeline de datos: scraper de gol.gg y Leaguepedia, normalización de estadísticas y persistencia en base de datos.</w:t>
       </w:r>
     </w:p>
     <w:p>
@@ -2459,7 +2459,7 @@
         </w:numPr>
       </w:pPr>
       <w:r>
-        <w:t xml:space="preserve">CU06 – Actualizar estadísticas (sistema): el pipeline se ejecuta al finalizar cada jornada, obtiene los resultados de la API de Riot, calcula los puntos y actualiza la base de datos.</w:t>
+        <w:t xml:space="preserve">CU06 – Actualizar estadísticas (sistema): el pipeline se ejecuta al finalizar cada jornada, obtiene los resultados de el scraping de gol.gg, calcula los puntos y actualiza la base de datos.</w:t>
       </w:r>
     </w:p>
     <w:p>
@@ -2607,7 +2607,7 @@
         </w:numPr>
       </w:pPr>
       <w:r>
-        <w:t xml:space="preserve">Pruebas del pipeline: ejecución del pipeline con datos mock de la API de Riot para verificar la normalización y persistencia de estadísticas.</w:t>
+        <w:t xml:space="preserve">Pruebas del pipeline: ejecución del pipeline con datos mock de el scraping de gol.gg para verificar la normalización y persistencia de estadísticas.</w:t>
       </w:r>
     </w:p>
     <w:p>
@@ -2699,7 +2699,7 @@
         </w:numPr>
       </w:pPr>
       <w:r>
-        <w:t xml:space="preserve">Capa de aplicación (Backend): FastAPI (Python 3.12) expone una API REST. Incluye el módulo de autenticación JWT, la lógica de negocio y el pipeline de datos de Riot Games ejecutado mediante APScheduler.</w:t>
+        <w:t xml:space="preserve">Capa de aplicación (Backend): FastAPI (Python 3.12) expone una API REST. Incluye el módulo de autenticación JWT, la lógica de negocio y el pipeline de scraping de gol.gg y Leaguepedia ejecutado mediante APScheduler.</w:t>
       </w:r>
     </w:p>
     <w:p>
@@ -3044,7 +3044,7 @@
         </w:numPr>
       </w:pPr>
       <w:r>
-        <w:t xml:space="preserve">2. Se consulta la API de Riot Games (endpoint de partidas y estadísticas de la LEC).</w:t>
+        <w:t xml:space="preserve">2. Se consulta scraping de gol.gg y Leaguepedia (endpoint de partidas y estadísticas de la LEC).</w:t>
       </w:r>
     </w:p>
     <w:p>
@@ -3627,7 +3627,7 @@
         </w:numPr>
       </w:pPr>
       <w:r>
-        <w:t xml:space="preserve">Riot Games API: fuente oficial de estadísticas de la LEC.</w:t>
+        <w:t xml:space="preserve">gol.gg (scraping vía Cloudflare Browser Rendering) y Leaguepedia (API MediaWiki): fuentes de estadísticas y datos de equipos.</w:t>
       </w:r>
     </w:p>
     <w:p>
@@ -3665,7 +3665,7 @@
         <w:t xml:space="preserve">Problema 1. </w:t>
       </w:r>
       <w:r>
-        <w:t xml:space="preserve">Problema 1 – Rate limiting de la API de Riot Games: la API gratuita limita a 20 peticiones por segundo. Solución: implementación de un sistema de cola con exponential backoff y caché de resultados en Redis para evitar peticiones redundantes.</w:t>
+        <w:t xml:space="preserve">Problema 1 – Rate limiting de gol.gg y Leaguepedia: la API gratuita limita a 20 peticiones por segundo. Solución: implementación de un sistema de cola con exponential backoff y caché de resultados en Redis para evitar peticiones redundantes.</w:t>
       </w:r>
     </w:p>
     <w:p>
@@ -3813,7 +3813,7 @@
         </w:numPr>
       </w:pPr>
       <w:r>
-        <w:t xml:space="preserve">test_pipeline.py: pruebas del pipeline con respuestas mock de la API de Riot usando pytest-httpx.</w:t>
+        <w:t xml:space="preserve">test_pipeline.py: pruebas del pipeline con respuestas mock de el scraping de gol.gg usando pytest-httpx.</w:t>
       </w:r>
     </w:p>
     <w:p>
@@ -4044,7 +4044,7 @@
         </w:numPr>
       </w:pPr>
       <w:r>
-        <w:t xml:space="preserve">2. Copiar el archivo de variables de entorno: cp .env.example .env y rellenar las variables (DB_PASSWORD, RIOT_API_KEY, SECRET_KEY, DOMAIN).</w:t>
+        <w:t xml:space="preserve">2. Copiar el archivo de variables de entorno: cp .env.example .env y rellenar las variables (DB_PASSWORD, CLOUDFLARE_ACCOUNT_ID y CLOUDFLARE_API_TOKEN, SECRET_KEY, DOMAIN).</w:t>
       </w:r>
     </w:p>
     <w:p>
@@ -4312,7 +4312,7 @@
         </w:numPr>
       </w:pPr>
       <w:r>
-        <w:t xml:space="preserve">Integración con APIs externas: la gestión del rate-limiting y la normalización de datos heterogéneos de la API de Riot ha sido el mayor reto técnico del proyecto.</w:t>
+        <w:t xml:space="preserve">Integración con APIs externas: la gestión del rate-limiting y la normalización de datos heterogéneos de el scraping de gol.gg ha sido el mayor reto técnico del proyecto.</w:t>
       </w:r>
     </w:p>
     <w:p>
@@ -4341,7 +4341,7 @@
     </w:p>
     <w:p>
       <w:r>
-        <w:t xml:space="preserve">El proyecto es perfectamente viable como producto real. Existe demanda demostrada y el stack tecnológico utilizado es escalable. La principal limitación actual es la disponibilidad de la API de Riot Games en el plan gratuito.</w:t>
+        <w:t xml:space="preserve">El proyecto es perfectamente viable como producto real. Existe demanda demostrada y el stack tecnológico utilizado es escalable. La principal limitación actual es la disponibilidad de gol.gg y Leaguepedia en el plan gratuito.</w:t>
       </w:r>
     </w:p>
     <w:p>
@@ -4505,7 +4505,7 @@
         </w:numPr>
       </w:pPr>
       <w:r>
-        <w:t xml:space="preserve">Riot Games Developer Portal. https://developer.riotgames.com/</w:t>
+        <w:t xml:space="preserve">gol.gg – Estadísticas LEC. https://gol.gg/ | Leaguepedia. https://lol.fandom.com/</w:t>
       </w:r>
     </w:p>
     <w:p>

</xml_diff>